<commit_message>
Send the UI locale when building judging sheets and correct the claim that it harms cross-lingual search
</commit_message>
<xml_diff>
--- a/semantic_vs_search/EU-FarmBook_OpenSearch_Retrieval_Strategy.docx
+++ b/semantic_vs_search/EU-FarmBook_OpenSearch_Retrieval_Strategy.docx
@@ -120,7 +120,7 @@
         <w:pStyle w:val="ListBullet"/>
       </w:pPr>
       <w:r>
-        <w:t xml:space="preserve">At least one vocabulary-mismatch query returns zero results despite use_semantic = true, which suggests a lexical gate filtering the candidate set before fusion. Supplying ui_locale halves cross-language retrieval on documents that have translations, from 0.125 to 0.075 MRR@10 at p below 0.01, the opposite of its intent.</w:t>
+        <w:t xml:space="preserve">At least one vocabulary-mismatch query returns zero results despite use_semantic = true, which suggests a lexical gate filtering the candidate set before fusion.</w:t>
       </w:r>
     </w:p>
     <w:p>
@@ -2781,7 +2781,7 @@
         <w:pStyle w:val="ListBullet"/>
       </w:pPr>
       <w:r>
-        <w:t xml:space="preserve">Query pre-processing must be language-aware before any lexical configuration is benchmarked, or configuration B is measuring the English-stopword defect rather than tuned lexical retrieval. Supplying ui_locale, which is the only way to switch the translated-field leg on, currently halves cross-language performance on documents that have translations, from 0.125 to 0.075 at p below 0.01. That regression should be resolved before the translated fields are counted as a working cross-lingual mechanism.</w:t>
+        <w:t xml:space="preserve">Query pre-processing must be language-aware before any lexical configuration is benchmarked, or configuration B is measuring the English-stopword defect rather than tuned lexical retrieval. ui_locale is what switches the translated-field leg on, and it is load-bearing rather than optional: measured on real logged queries, a Spanish search returns 10 results with the locale and 0 without, and rebuilding a 50-query sample with it made the result count match the production log for 50 of 50 queries. An earlier draft of this note called it a regression on the strength of a known-item ranking test over LLM-written sentences; that test was blind to whether anything was returned at all. The api-core path already sends it, so a search made without it is the anomaly.</w:t>
       </w:r>
     </w:p>
     <w:p>

</xml_diff>